<commit_message>
updated drafts, running models without cones and ppt to be able to weigh model fit without these two factors
</commit_message>
<xml_diff>
--- a/drafts/pnas:ecolets/Miller-terKuile_pjaySI_Nov2025.docx
+++ b/drafts/pnas:ecolets/Miller-terKuile_pjaySI_Nov2025.docx
@@ -11,21 +11,31 @@
           <w:b/>
           <w:bCs/>
         </w:rPr>
-        <w:t xml:space="preserve">Supporting Information for: </w:t>
-      </w:r>
-      <w:r>
-        <w:t>Caching in: Quantifying the temporal relationships of seed dispersal interactions</w:t>
-      </w:r>
-    </w:p>
-    <w:p>
-      <w:pPr>
-        <w:pStyle w:val="FirstParagraph"/>
-      </w:pPr>
+        <w:t>Supporting Information for:</w:t>
+      </w:r>
+      <w:r>
+        <w:t xml:space="preserve"> </w:t>
+      </w:r>
       <w:r>
         <w:rPr>
           <w:b/>
           <w:bCs/>
         </w:rPr>
+        <w:t xml:space="preserve">Caching in: </w:t>
+      </w:r>
+      <w:r>
+        <w:t>A seed dispersal mutualism portends the decline of an imperiled songbird-pine system</w:t>
+      </w:r>
+    </w:p>
+    <w:p>
+      <w:pPr>
+        <w:pStyle w:val="FirstParagraph"/>
+      </w:pPr>
+      <w:r>
+        <w:rPr>
+          <w:b/>
+          <w:bCs/>
+        </w:rPr>
         <w:t>Author List</w:t>
       </w:r>
       <w:r>
@@ -56,22 +66,25 @@
         <w:t>4</w:t>
       </w:r>
       <w:r>
-        <w:t>, Kiona Ogle</w:t>
+        <w:t>, Jamie S. Sanderlin</w:t>
       </w:r>
       <w:r>
         <w:rPr>
           <w:vertAlign w:val="superscript"/>
         </w:rPr>
+        <w:t>2</w:t>
+      </w:r>
+      <w:r>
+        <w:t xml:space="preserve">, </w:t>
+      </w:r>
+      <w:r>
+        <w:t>Kiona Ogle</w:t>
+      </w:r>
+      <w:r>
+        <w:rPr>
+          <w:vertAlign w:val="superscript"/>
+        </w:rPr>
         <w:t>1</w:t>
-      </w:r>
-      <w:r>
-        <w:t>, Jamie S. Sanderlin</w:t>
-      </w:r>
-      <w:r>
-        <w:rPr>
-          <w:vertAlign w:val="superscript"/>
-        </w:rPr>
-        <w:t>2</w:t>
       </w:r>
     </w:p>
     <w:p>
@@ -630,12 +643,176 @@
     <w:p>
       <w:pPr>
         <w:pStyle w:val="BodyText"/>
-      </w:pPr>
-      <w:r>
         <w:rPr>
           <w:i/>
           <w:iCs/>
         </w:rPr>
+      </w:pPr>
+      <w:r>
+        <w:rPr>
+          <w:i/>
+          <w:iCs/>
+        </w:rPr>
+        <w:t>Model</w:t>
+      </w:r>
+      <w:r>
+        <w:rPr>
+          <w:i/>
+          <w:iCs/>
+        </w:rPr>
+        <w:t xml:space="preserve"> performance and</w:t>
+      </w:r>
+      <w:r>
+        <w:rPr>
+          <w:i/>
+          <w:iCs/>
+        </w:rPr>
+        <w:t xml:space="preserve"> </w:t>
+      </w:r>
+      <w:r>
+        <w:rPr>
+          <w:i/>
+          <w:iCs/>
+        </w:rPr>
+        <w:t>g</w:t>
+      </w:r>
+      <w:r>
+        <w:rPr>
+          <w:i/>
+          <w:iCs/>
+        </w:rPr>
+        <w:t>oodness-of-</w:t>
+      </w:r>
+      <w:r>
+        <w:rPr>
+          <w:i/>
+          <w:iCs/>
+        </w:rPr>
+        <w:t>f</w:t>
+      </w:r>
+      <w:r>
+        <w:rPr>
+          <w:i/>
+          <w:iCs/>
+        </w:rPr>
+        <w:t>it</w:t>
+      </w:r>
+    </w:p>
+    <w:p>
+      <w:pPr>
+        <w:pStyle w:val="BodyText"/>
+        <w:spacing w:before="0" w:after="0"/>
+        <w:ind w:firstLine="720"/>
+      </w:pPr>
+      <w:r>
+        <w:t xml:space="preserve">All stochastic model parameters converged with an </w:t>
+      </w:r>
+      <m:oMath>
+        <m:acc>
+          <m:accPr>
+            <m:ctrlPr>
+              <w:rPr>
+                <w:rFonts w:ascii="Cambria Math" w:hAnsi="Cambria Math"/>
+              </w:rPr>
+            </m:ctrlPr>
+          </m:accPr>
+          <m:e>
+            <m:r>
+              <w:rPr>
+                <w:rFonts w:ascii="Cambria Math" w:hAnsi="Cambria Math"/>
+              </w:rPr>
+              <m:t>R</m:t>
+            </m:r>
+          </m:e>
+        </m:acc>
+        <m:r>
+          <m:rPr>
+            <m:sty m:val="p"/>
+          </m:rPr>
+          <w:rPr>
+            <w:rFonts w:ascii="Cambria Math" w:hAnsi="Cambria Math"/>
+          </w:rPr>
+          <m:t>≤</m:t>
+        </m:r>
+      </m:oMath>
+      <w:r>
+        <w:t xml:space="preserve"> 1.1 (</w:t>
+      </w:r>
+      <w:r>
+        <w:t>SI Figure 2</w:t>
+      </w:r>
+      <w:r>
+        <w:t xml:space="preserve">). </w:t>
+      </w:r>
+      <w:r>
+        <w:t xml:space="preserve">Regression of observed data versus predicted data (based on the posterior mean of 1000 samples of replicated data) had a mean </w:t>
+      </w:r>
+      <w:r>
+        <w:rPr>
+          <w:i/>
+          <w:iCs/>
+        </w:rPr>
+        <w:t>R</w:t>
+      </w:r>
+      <w:r>
+        <w:rPr>
+          <w:vertAlign w:val="superscript"/>
+        </w:rPr>
+        <w:t>2</w:t>
+      </w:r>
+      <w:r>
+        <w:t xml:space="preserve"> of 0.74 (</w:t>
+      </w:r>
+      <w:proofErr w:type="spellStart"/>
+      <w:r>
+        <w:t>s.e.</w:t>
+      </w:r>
+      <w:proofErr w:type="spellEnd"/>
+      <w:r>
+        <w:t xml:space="preserve"> 0.0003). In </w:t>
+      </w:r>
+      <w:r>
+        <w:t xml:space="preserve">general, the model under-estimated the highest </w:t>
+      </w:r>
+      <w:r>
+        <w:t xml:space="preserve">pinyon jay </w:t>
+      </w:r>
+      <w:r>
+        <w:t>counts but performed well for most other values (SI Figure 3). The RMSE for our in-sample dataset had an average value of 3.25 (</w:t>
+      </w:r>
+      <w:proofErr w:type="spellStart"/>
+      <w:r>
+        <w:t>s.e.</w:t>
+      </w:r>
+      <w:proofErr w:type="spellEnd"/>
+      <w:r>
+        <w:t>: 0.001) and the out-of-sample dataset had a value of 5.10 (</w:t>
+      </w:r>
+      <w:proofErr w:type="spellStart"/>
+      <w:r>
+        <w:t>s.e.</w:t>
+      </w:r>
+      <w:proofErr w:type="spellEnd"/>
+      <w:r>
+        <w:t xml:space="preserve">: 0.0002; SI Figure 4). Thus, our model predicted our in-sample data slightly better than the out-of-sample data, but neither RMSE values are large considering the scale of the count data (counts per checklist ranged from 0 to 350), suggesting good model fit and predictive </w:t>
+      </w:r>
+      <w:r>
+        <w:lastRenderedPageBreak/>
+        <w:t>capacity. We observed no strong spatial autocorrelation in the residuals (SI Figure 5).</w:t>
+      </w:r>
+      <w:r>
+        <w:t xml:space="preserve"> Results on covariates influencing detection can be found in the Supporting Information. </w:t>
+      </w:r>
+    </w:p>
+    <w:p>
+      <w:pPr>
+        <w:pStyle w:val="BodyText"/>
+      </w:pPr>
+      <w:r>
+        <w:rPr>
+          <w:i/>
+          <w:iCs/>
+        </w:rPr>
         <w:t>Covariates influencing detection</w:t>
       </w:r>
     </w:p>
@@ -644,19 +821,7 @@
         <w:pStyle w:val="BodyText"/>
       </w:pPr>
       <w:r>
-        <w:t>Pinyon jay detection probability was most influenced by the number of observers, with fewer birds observed on checklists with more observers (</w:t>
-      </w:r>
-      <w:r>
-        <w:t>-1.01 [-1.10, -1.04]</w:t>
-      </w:r>
-      <w:r>
-        <w:t>). Checklists where observers walked at faster speeds had more detections (</w:t>
-      </w:r>
-      <w:r>
-        <w:t>0.43 [0.40, 0.46]</w:t>
-      </w:r>
-      <w:r>
-        <w:t xml:space="preserve">). Speed incorporated the distance (“effort”) and duration variables from the original </w:t>
+        <w:t xml:space="preserve">Pinyon jay detection probability was most influenced by the number of observers, with fewer birds observed on checklists with more observers (-1.01 [-1.10, -1.04]). Checklists where observers walked at faster speeds had more detections (0.43 [0.40, 0.46]). Speed incorporated the distance (“effort”) and duration variables from the original </w:t>
       </w:r>
       <w:proofErr w:type="gramStart"/>
       <w:r>
@@ -664,13 +829,7 @@
       </w:r>
       <w:proofErr w:type="gramEnd"/>
       <w:r>
-        <w:t xml:space="preserve"> and this effect is likely influenced by checklists where observers went further in a traveling checklist. Fewer birds were observed at later start times (</w:t>
-      </w:r>
-      <w:r>
-        <w:t>-0.19 [-0.25, -0.14]</w:t>
-      </w:r>
-      <w:r>
-        <w:t>) and there was a weak effect in which longer surveys had fewer detections (-0.03 [-0.07, -0.003]).</w:t>
+        <w:t xml:space="preserve"> and this effect is likely influenced by checklists where observers went further in a traveling checklist. Fewer birds were observed at later start times (-0.19 [-0.25, -0.14]) and there was a weak effect in which longer surveys had fewer detections (-0.03 [-0.07, -0.003]).</w:t>
       </w:r>
     </w:p>
     <w:p>
@@ -691,7 +850,6 @@
           <w:b/>
           <w:bCs/>
         </w:rPr>
-        <w:lastRenderedPageBreak/>
         <w:t>SI Figures</w:t>
       </w:r>
     </w:p>
@@ -707,6 +865,7 @@
         <w:rPr>
           <w:noProof/>
         </w:rPr>
+        <w:lastRenderedPageBreak/>
         <w:drawing>
           <wp:inline distT="0" distB="0" distL="0" distR="0" wp14:anchorId="50342F83" wp14:editId="7D0F9A90">
             <wp:extent cx="2933530" cy="1955685"/>
@@ -947,11 +1106,7 @@
         <w:t xml:space="preserve">SI Figure 1. </w:t>
       </w:r>
       <w:r>
-        <w:t xml:space="preserve">Validation results supporting the use of space-for-time substitution of replicate checklists within sampling polygons. To use replicate eBird surveys within a year at a location in models such as N-mixture or occupancy models, checklists need to represent sites that display the full range of values for covariates of interest. In general, checklists in our dataset meet these criteria. Data represented here are values for all raster grid cells for all years (~1 million grid cells, depending on covariate). Thus, for the two covariates for which we are missing the upper </w:t>
-      </w:r>
-      <w:r>
-        <w:lastRenderedPageBreak/>
-        <w:t xml:space="preserve">tails, (a) cone availability and (e) pinyon basal area, these represent extreme outliers (&lt;1% of total values in the dataset; </w:t>
+        <w:t xml:space="preserve">Validation results supporting the use of space-for-time substitution of replicate checklists within sampling polygons. To use replicate eBird surveys within a year at a location in models such as N-mixture or occupancy models, checklists need to represent sites that display the full range of values for covariates of interest. In general, checklists in our dataset meet these criteria. Data represented here are values for all raster grid cells for all years (~1 million grid cells, depending on covariate). Thus, for the two covariates for which we are missing the upper tails, (a) cone availability and (e) pinyon basal area, these represent extreme outliers (&lt;1% of total values in the dataset; </w:t>
       </w:r>
       <w:r>
         <w:t>~20-200 raster grid cells, depending on covariate</w:t>
@@ -979,6 +1134,7 @@
         <w:rPr>
           <w:noProof/>
         </w:rPr>
+        <w:lastRenderedPageBreak/>
         <w:drawing>
           <wp:inline distT="0" distB="0" distL="0" distR="0" wp14:anchorId="054FA9DB" wp14:editId="63205C0B">
             <wp:extent cx="5943600" cy="4754880"/>
@@ -2084,7 +2240,7 @@
     <w:lsdException w:name="toc 9" w:semiHidden="1" w:uiPriority="39" w:unhideWhenUsed="1"/>
     <w:lsdException w:name="Normal Indent" w:semiHidden="1" w:unhideWhenUsed="1"/>
     <w:lsdException w:name="footnote text" w:semiHidden="1" w:unhideWhenUsed="1"/>
-    <w:lsdException w:name="annotation text" w:semiHidden="1" w:unhideWhenUsed="1"/>
+    <w:lsdException w:name="annotation text" w:semiHidden="1" w:uiPriority="0" w:unhideWhenUsed="1"/>
     <w:lsdException w:name="header" w:semiHidden="1" w:unhideWhenUsed="1"/>
     <w:lsdException w:name="footer" w:semiHidden="1" w:unhideWhenUsed="1"/>
     <w:lsdException w:name="index heading" w:semiHidden="1" w:unhideWhenUsed="1"/>
@@ -2093,7 +2249,7 @@
     <w:lsdException w:name="envelope address" w:semiHidden="1" w:unhideWhenUsed="1"/>
     <w:lsdException w:name="envelope return" w:semiHidden="1" w:unhideWhenUsed="1"/>
     <w:lsdException w:name="footnote reference" w:semiHidden="1" w:unhideWhenUsed="1"/>
-    <w:lsdException w:name="annotation reference" w:semiHidden="1" w:unhideWhenUsed="1"/>
+    <w:lsdException w:name="annotation reference" w:semiHidden="1" w:uiPriority="0" w:unhideWhenUsed="1"/>
     <w:lsdException w:name="line number" w:semiHidden="1" w:unhideWhenUsed="1"/>
     <w:lsdException w:name="page number" w:semiHidden="1" w:unhideWhenUsed="1"/>
     <w:lsdException w:name="endnote reference" w:semiHidden="1" w:unhideWhenUsed="1"/>
@@ -3084,6 +3240,37 @@
       <w:szCs w:val="18"/>
     </w:rPr>
   </w:style>
+  <w:style w:type="character" w:styleId="CommentReference">
+    <w:name w:val="annotation reference"/>
+    <w:basedOn w:val="DefaultParagraphFont"/>
+    <w:rsid w:val="0019418C"/>
+    <w:rPr>
+      <w:sz w:val="16"/>
+      <w:szCs w:val="16"/>
+    </w:rPr>
+  </w:style>
+  <w:style w:type="paragraph" w:styleId="CommentText">
+    <w:name w:val="annotation text"/>
+    <w:basedOn w:val="Normal"/>
+    <w:link w:val="CommentTextChar"/>
+    <w:rsid w:val="0019418C"/>
+    <w:rPr>
+      <w:sz w:val="20"/>
+      <w:szCs w:val="20"/>
+    </w:rPr>
+  </w:style>
+  <w:style w:type="character" w:customStyle="1" w:styleId="CommentTextChar">
+    <w:name w:val="Comment Text Char"/>
+    <w:basedOn w:val="DefaultParagraphFont"/>
+    <w:link w:val="CommentText"/>
+    <w:rsid w:val="0019418C"/>
+    <w:rPr>
+      <w:kern w:val="0"/>
+      <w:sz w:val="20"/>
+      <w:szCs w:val="20"/>
+      <w14:ligatures w14:val="none"/>
+    </w:rPr>
+  </w:style>
 </w:styles>
 </file>
 

</xml_diff>